<commit_message>
adding week number 5
</commit_message>
<xml_diff>
--- a/semanas/semana4/html/examen 4.docx
+++ b/semanas/semana4/html/examen 4.docx
@@ -7,79 +7,50 @@
         <w:rPr>
           <w:b/>
           <w:bCs/>
-          <w:lang w:val="en-US"/>
-        </w:rPr>
-      </w:pPr>
-      <w:r>
-        <w:rPr>
-          <w:b/>
-          <w:bCs/>
-          <w:lang w:val="en-US"/>
+        </w:rPr>
+      </w:pPr>
+      <w:r>
+        <w:rPr>
+          <w:b/>
+          <w:bCs/>
         </w:rPr>
         <w:t>Parte I: Gramática (10 preguntas)</w:t>
       </w:r>
     </w:p>
     <w:p>
-      <w:pPr>
-        <w:rPr>
-          <w:lang w:val="en-US"/>
-        </w:rPr>
-      </w:pPr>
-      <w:r>
-        <w:rPr>
-          <w:b/>
-          <w:bCs/>
-          <w:lang w:val="en-US"/>
+      <w:r>
+        <w:rPr>
+          <w:b/>
+          <w:bCs/>
         </w:rPr>
         <w:t>1. ¿Cuál de las siguientes afirmaciones sobre los sustantivos hebreos es VERDADERA?</w:t>
       </w:r>
       <w:r>
-        <w:rPr>
-          <w:lang w:val="en-US"/>
-        </w:rPr>
         <w:br/>
         <w:t>a) Todos los sustantivos tienen terminaciones especiales que indican su género.</w:t>
       </w:r>
       <w:r>
-        <w:rPr>
-          <w:lang w:val="en-US"/>
-        </w:rPr>
         <w:br/>
         <w:t>b) Los sustantivos hebreos pueden ser singulares, plurales o duales.</w:t>
       </w:r>
       <w:r>
-        <w:rPr>
-          <w:lang w:val="en-US"/>
-        </w:rPr>
         <w:br/>
         <w:t>c) El género en hebreo siempre coincide con el sexo biológico del objeto.</w:t>
       </w:r>
       <w:r>
-        <w:rPr>
-          <w:lang w:val="en-US"/>
-        </w:rPr>
         <w:br/>
         <w:t>d) No existen sustantivos femeninos sin terminación.</w:t>
       </w:r>
     </w:p>
     <w:p>
-      <w:pPr>
-        <w:rPr>
-          <w:lang w:val="en-US"/>
-        </w:rPr>
-      </w:pPr>
-      <w:r>
-        <w:rPr>
-          <w:b/>
-          <w:bCs/>
-          <w:lang w:val="en-US"/>
+      <w:r>
+        <w:rPr>
+          <w:b/>
+          <w:bCs/>
         </w:rPr>
         <w:t>2. ¿Cuál es la terminación característica de los sustantivos masculinos plurales?</w:t>
       </w:r>
       <w:r>
-        <w:rPr>
-          <w:lang w:val="en-US"/>
-        </w:rPr>
         <w:br/>
         <w:t xml:space="preserve">a) </w:t>
       </w:r>
@@ -90,9 +61,6 @@
         <w:t>◌ִים</w:t>
       </w:r>
       <w:r>
-        <w:rPr>
-          <w:lang w:val="en-US"/>
-        </w:rPr>
         <w:br/>
         <w:t>b) ◌</w:t>
       </w:r>
@@ -103,9 +71,6 @@
         <w:t>וֹת</w:t>
       </w:r>
       <w:r>
-        <w:rPr>
-          <w:lang w:val="en-US"/>
-        </w:rPr>
         <w:br/>
         <w:t xml:space="preserve">c) </w:t>
       </w:r>
@@ -116,9 +81,6 @@
         <w:t>◌ַ֫יִם</w:t>
       </w:r>
       <w:r>
-        <w:rPr>
-          <w:lang w:val="en-US"/>
-        </w:rPr>
         <w:br/>
         <w:t xml:space="preserve">d) </w:t>
       </w:r>
@@ -130,23 +92,14 @@
       </w:r>
     </w:p>
     <w:p>
-      <w:pPr>
-        <w:rPr>
-          <w:lang w:val="en-US"/>
-        </w:rPr>
-      </w:pPr>
-      <w:r>
-        <w:rPr>
-          <w:b/>
-          <w:bCs/>
-          <w:lang w:val="en-US"/>
+      <w:r>
+        <w:rPr>
+          <w:b/>
+          <w:bCs/>
         </w:rPr>
         <w:t>3. ¿Cuál es la terminación característica de los sustantivos femeninos plurales?</w:t>
       </w:r>
       <w:r>
-        <w:rPr>
-          <w:lang w:val="en-US"/>
-        </w:rPr>
         <w:br/>
         <w:t xml:space="preserve">a) </w:t>
       </w:r>
@@ -157,9 +110,6 @@
         <w:t>◌ִים</w:t>
       </w:r>
       <w:r>
-        <w:rPr>
-          <w:lang w:val="en-US"/>
-        </w:rPr>
         <w:br/>
         <w:t>b) ◌</w:t>
       </w:r>
@@ -170,9 +120,6 @@
         <w:t>וֹת</w:t>
       </w:r>
       <w:r>
-        <w:rPr>
-          <w:lang w:val="en-US"/>
-        </w:rPr>
         <w:br/>
         <w:t xml:space="preserve">c) </w:t>
       </w:r>
@@ -183,9 +130,6 @@
         <w:t>◌ַ֫יִם</w:t>
       </w:r>
       <w:r>
-        <w:rPr>
-          <w:lang w:val="en-US"/>
-        </w:rPr>
         <w:br/>
         <w:t xml:space="preserve">d) </w:t>
       </w:r>
@@ -197,16 +141,10 @@
       </w:r>
     </w:p>
     <w:p>
-      <w:pPr>
-        <w:rPr>
-          <w:lang w:val="en-US"/>
-        </w:rPr>
-      </w:pPr>
-      <w:r>
-        <w:rPr>
-          <w:b/>
-          <w:bCs/>
-          <w:lang w:val="en-US"/>
+      <w:r>
+        <w:rPr>
+          <w:b/>
+          <w:bCs/>
         </w:rPr>
         <w:t xml:space="preserve">4. ¿Qué indica la terminación </w:t>
       </w:r>
@@ -222,57 +160,35 @@
         <w:rPr>
           <w:b/>
           <w:bCs/>
-          <w:lang w:val="en-US"/>
         </w:rPr>
         <w:t xml:space="preserve"> en un sustantivo hebreo?</w:t>
       </w:r>
       <w:r>
-        <w:rPr>
-          <w:lang w:val="en-US"/>
-        </w:rPr>
         <w:br/>
         <w:t>a) Que es femenino singular</w:t>
       </w:r>
       <w:r>
-        <w:rPr>
-          <w:lang w:val="en-US"/>
-        </w:rPr>
         <w:br/>
         <w:t>b) Que es masculino plural</w:t>
       </w:r>
       <w:r>
-        <w:rPr>
-          <w:lang w:val="en-US"/>
-        </w:rPr>
         <w:br/>
         <w:t>c) Que es dual (dos elementos)</w:t>
       </w:r>
       <w:r>
-        <w:rPr>
-          <w:lang w:val="en-US"/>
-        </w:rPr>
         <w:br/>
         <w:t>d) Que es un sustantivo abstracto</w:t>
       </w:r>
     </w:p>
     <w:p>
-      <w:pPr>
-        <w:rPr>
-          <w:lang w:val="en-US"/>
-        </w:rPr>
-      </w:pPr>
-      <w:r>
-        <w:rPr>
-          <w:b/>
-          <w:bCs/>
-          <w:lang w:val="en-US"/>
+      <w:r>
+        <w:rPr>
+          <w:b/>
+          <w:bCs/>
         </w:rPr>
         <w:t>5. ¿Cuál de las siguientes palabras es un ejemplo de sustantivo femenino SINGULAR que NO tiene terminación femenina visible?</w:t>
       </w:r>
       <w:r>
-        <w:rPr>
-          <w:lang w:val="en-US"/>
-        </w:rPr>
         <w:br/>
         <w:t xml:space="preserve">a) </w:t>
       </w:r>
@@ -283,9 +199,6 @@
         <w:t>תּוֹרָה</w:t>
       </w:r>
       <w:r>
-        <w:rPr>
-          <w:lang w:val="en-US"/>
-        </w:rPr>
         <w:br/>
         <w:t xml:space="preserve">b) </w:t>
       </w:r>
@@ -296,9 +209,6 @@
         <w:t>מַלְכָּה</w:t>
       </w:r>
       <w:r>
-        <w:rPr>
-          <w:lang w:val="en-US"/>
-        </w:rPr>
         <w:br/>
         <w:t xml:space="preserve">c) </w:t>
       </w:r>
@@ -309,9 +219,6 @@
         <w:t>עִיר</w:t>
       </w:r>
       <w:r>
-        <w:rPr>
-          <w:lang w:val="en-US"/>
-        </w:rPr>
         <w:br/>
         <w:t xml:space="preserve">d) </w:t>
       </w:r>
@@ -323,16 +230,10 @@
       </w:r>
     </w:p>
     <w:p>
-      <w:pPr>
-        <w:rPr>
-          <w:lang w:val="en-US"/>
-        </w:rPr>
-      </w:pPr>
-      <w:r>
-        <w:rPr>
-          <w:b/>
-          <w:bCs/>
-          <w:lang w:val="en-US"/>
+      <w:r>
+        <w:rPr>
+          <w:b/>
+          <w:bCs/>
         </w:rPr>
         <w:t xml:space="preserve">6. ¿Qué sucede con la primera vocal de un sustantivo como </w:t>
       </w:r>
@@ -348,7 +249,6 @@
         <w:rPr>
           <w:b/>
           <w:bCs/>
-          <w:lang w:val="en-US"/>
         </w:rPr>
         <w:t xml:space="preserve"> (palabra) cuando se pluraliza a </w:t>
       </w:r>
@@ -364,50 +264,41 @@
         <w:rPr>
           <w:b/>
           <w:bCs/>
-          <w:lang w:val="en-US"/>
         </w:rPr>
         <w:t>?</w:t>
       </w:r>
       <w:r>
-        <w:rPr>
-          <w:lang w:val="en-US"/>
-        </w:rPr>
         <w:br/>
         <w:t>a) La vocal se alarga</w:t>
       </w:r>
       <w:r>
-        <w:rPr>
-          <w:lang w:val="en-US"/>
-        </w:rPr>
-        <w:br/>
-        <w:t>b) La vocal se reduce a Shewa por estar en sílaba propretonica</w:t>
-      </w:r>
-      <w:r>
-        <w:rPr>
-          <w:lang w:val="en-US"/>
-        </w:rPr>
-        <w:br/>
-        <w:t>c) La vocal se convierte en Qamets</w:t>
-      </w:r>
-      <w:r>
-        <w:rPr>
-          <w:lang w:val="en-US"/>
-        </w:rPr>
+        <w:br/>
+        <w:t xml:space="preserve">b) La vocal se reduce a Shewa por estar en sílaba </w:t>
+      </w:r>
+      <w:proofErr w:type="spellStart"/>
+      <w:r>
+        <w:t>propretonica</w:t>
+      </w:r>
+      <w:proofErr w:type="spellEnd"/>
+      <w:r>
+        <w:br/>
+        <w:t xml:space="preserve">c) La vocal se convierte en </w:t>
+      </w:r>
+      <w:proofErr w:type="spellStart"/>
+      <w:r>
+        <w:t>Qamets</w:t>
+      </w:r>
+      <w:proofErr w:type="spellEnd"/>
+      <w:r>
         <w:br/>
         <w:t>d) La vocal desaparece completamente</w:t>
       </w:r>
     </w:p>
     <w:p>
-      <w:pPr>
-        <w:rPr>
-          <w:lang w:val="en-US"/>
-        </w:rPr>
-      </w:pPr>
-      <w:r>
-        <w:rPr>
-          <w:b/>
-          <w:bCs/>
-          <w:lang w:val="en-US"/>
+      <w:r>
+        <w:rPr>
+          <w:b/>
+          <w:bCs/>
         </w:rPr>
         <w:t xml:space="preserve">7. ¿Cómo se clasifican sustantivos como </w:t>
       </w:r>
@@ -423,63 +314,48 @@
         <w:rPr>
           <w:b/>
           <w:bCs/>
-          <w:lang w:val="en-US"/>
         </w:rPr>
         <w:t xml:space="preserve"> (rey) que tienen el acento en la primera sílaba?</w:t>
       </w:r>
       <w:r>
-        <w:rPr>
-          <w:lang w:val="en-US"/>
-        </w:rPr>
-        <w:br/>
-      </w:r>
-      <w:r>
-        <w:rPr>
-          <w:lang w:val="en-US"/>
-        </w:rPr>
+        <w:br/>
+      </w:r>
+      <w:r>
         <w:lastRenderedPageBreak/>
         <w:t>a) Sustantivos femeninos</w:t>
       </w:r>
       <w:r>
-        <w:rPr>
-          <w:lang w:val="en-US"/>
-        </w:rPr>
-        <w:br/>
-        <w:t>b) Sustantivos segolados</w:t>
-      </w:r>
-      <w:r>
-        <w:rPr>
-          <w:lang w:val="en-US"/>
-        </w:rPr>
+        <w:br/>
+        <w:t xml:space="preserve">b) Sustantivos </w:t>
+      </w:r>
+      <w:proofErr w:type="spellStart"/>
+      <w:r>
+        <w:t>segolados</w:t>
+      </w:r>
+      <w:proofErr w:type="spellEnd"/>
+      <w:r>
         <w:br/>
         <w:t>c) Sustantivos geminados</w:t>
       </w:r>
       <w:r>
-        <w:rPr>
-          <w:lang w:val="en-US"/>
-        </w:rPr>
-        <w:br/>
-        <w:t>d) Sustantivos propretónicos</w:t>
-      </w:r>
-    </w:p>
-    <w:p>
-      <w:pPr>
-        <w:rPr>
-          <w:lang w:val="en-US"/>
-        </w:rPr>
-      </w:pPr>
-      <w:r>
-        <w:rPr>
-          <w:b/>
-          <w:bCs/>
-          <w:lang w:val="en-US"/>
+        <w:br/>
+        <w:t xml:space="preserve">d) Sustantivos </w:t>
+      </w:r>
+      <w:proofErr w:type="spellStart"/>
+      <w:r>
+        <w:t>propretónicos</w:t>
+      </w:r>
+      <w:proofErr w:type="spellEnd"/>
+    </w:p>
+    <w:p>
+      <w:r>
+        <w:rPr>
+          <w:b/>
+          <w:bCs/>
         </w:rPr>
         <w:t>8. ¿Cuál de los siguientes sustantivos es un ejemplo de palabra con forma DUAL pero que se traduce en singular?</w:t>
       </w:r>
       <w:r>
-        <w:rPr>
-          <w:lang w:val="en-US"/>
-        </w:rPr>
         <w:br/>
         <w:t xml:space="preserve">a) </w:t>
       </w:r>
@@ -490,9 +366,6 @@
         <w:t>סוּסִים</w:t>
       </w:r>
       <w:r>
-        <w:rPr>
-          <w:lang w:val="en-US"/>
-        </w:rPr>
         <w:br/>
         <w:t xml:space="preserve">b) </w:t>
       </w:r>
@@ -503,15 +376,9 @@
         <w:t>מַ֫יִם</w:t>
       </w:r>
       <w:r>
-        <w:rPr>
-          <w:lang w:val="en-US"/>
-        </w:rPr>
         <w:t xml:space="preserve"> (agua)</w:t>
       </w:r>
       <w:r>
-        <w:rPr>
-          <w:lang w:val="en-US"/>
-        </w:rPr>
         <w:br/>
         <w:t xml:space="preserve">c) </w:t>
       </w:r>
@@ -522,9 +389,6 @@
         <w:t>מְלָכִים</w:t>
       </w:r>
       <w:r>
-        <w:rPr>
-          <w:lang w:val="en-US"/>
-        </w:rPr>
         <w:br/>
         <w:t xml:space="preserve">d) </w:t>
       </w:r>
@@ -536,18 +400,28 @@
       </w:r>
     </w:p>
     <w:p>
-      <w:pPr>
-        <w:rPr>
-          <w:lang w:val="en-US"/>
-        </w:rPr>
-      </w:pPr>
-      <w:r>
-        <w:rPr>
-          <w:b/>
-          <w:bCs/>
-          <w:lang w:val="en-US"/>
-        </w:rPr>
-        <w:t xml:space="preserve">9. ¿Qué tipo de Daguesh aparece en el plural de un sustantivo geminado como </w:t>
+      <w:r>
+        <w:rPr>
+          <w:b/>
+          <w:bCs/>
+        </w:rPr>
+        <w:t xml:space="preserve">9. ¿Qué tipo de </w:t>
+      </w:r>
+      <w:proofErr w:type="spellStart"/>
+      <w:r>
+        <w:rPr>
+          <w:b/>
+          <w:bCs/>
+        </w:rPr>
+        <w:t>Daguesh</w:t>
+      </w:r>
+      <w:proofErr w:type="spellEnd"/>
+      <w:r>
+        <w:rPr>
+          <w:b/>
+          <w:bCs/>
+        </w:rPr>
+        <w:t xml:space="preserve"> aparece en el plural de un sustantivo geminado como </w:t>
       </w:r>
       <w:r>
         <w:rPr>
@@ -561,7 +435,6 @@
         <w:rPr>
           <w:b/>
           <w:bCs/>
-          <w:lang w:val="en-US"/>
         </w:rPr>
         <w:t xml:space="preserve"> (pueblo) que se convierte en </w:t>
       </w:r>
@@ -577,52 +450,78 @@
         <w:rPr>
           <w:b/>
           <w:bCs/>
-          <w:lang w:val="en-US"/>
         </w:rPr>
         <w:t>?</w:t>
       </w:r>
       <w:r>
-        <w:rPr>
-          <w:lang w:val="en-US"/>
-        </w:rPr>
-        <w:br/>
-        <w:t>a) Daguesh Lene</w:t>
-      </w:r>
-      <w:r>
-        <w:rPr>
-          <w:lang w:val="en-US"/>
-        </w:rPr>
-        <w:br/>
-        <w:t>b) Daguesh Forte (representa la consonante gemela)</w:t>
-      </w:r>
-      <w:r>
-        <w:rPr>
-          <w:lang w:val="en-US"/>
-        </w:rPr>
-        <w:br/>
-        <w:t>c) Mappiq</w:t>
-      </w:r>
-      <w:r>
-        <w:rPr>
-          <w:lang w:val="en-US"/>
-        </w:rPr>
-        <w:br/>
-        <w:t>d) No lleva Daguesh</w:t>
-      </w:r>
-    </w:p>
-    <w:p>
-      <w:pPr>
-        <w:rPr>
-          <w:lang w:val="en-US"/>
-        </w:rPr>
-      </w:pPr>
-      <w:r>
-        <w:rPr>
-          <w:b/>
-          <w:bCs/>
-          <w:lang w:val="en-US"/>
-        </w:rPr>
-        <w:t xml:space="preserve">10. Según las reglas del Shewa, ¿qué ocurre cuando dos Shewas vocales quedarían contiguos al principio de una palabra (ej. </w:t>
+        <w:br/>
+        <w:t>a</w:t>
+      </w:r>
+      <w:r>
+        <w:t xml:space="preserve">) </w:t>
+      </w:r>
+      <w:proofErr w:type="spellStart"/>
+      <w:r>
+        <w:t>Daguesh</w:t>
+      </w:r>
+      <w:proofErr w:type="spellEnd"/>
+      <w:r>
+        <w:t xml:space="preserve"> Lene</w:t>
+      </w:r>
+      <w:r>
+        <w:br/>
+        <w:t xml:space="preserve">b) </w:t>
+      </w:r>
+      <w:proofErr w:type="spellStart"/>
+      <w:r>
+        <w:t>Daguesh</w:t>
+      </w:r>
+      <w:proofErr w:type="spellEnd"/>
+      <w:r>
+        <w:t xml:space="preserve"> Forte</w:t>
+      </w:r>
+      <w:r>
+        <w:br/>
+        <w:t xml:space="preserve">c) </w:t>
+      </w:r>
+      <w:proofErr w:type="spellStart"/>
+      <w:r>
+        <w:t>Mappiq</w:t>
+      </w:r>
+      <w:proofErr w:type="spellEnd"/>
+      <w:r>
+        <w:br/>
+        <w:t xml:space="preserve">d) No lleva </w:t>
+      </w:r>
+      <w:proofErr w:type="spellStart"/>
+      <w:r>
+        <w:t>Daguesh</w:t>
+      </w:r>
+      <w:proofErr w:type="spellEnd"/>
+    </w:p>
+    <w:p>
+      <w:r>
+        <w:rPr>
+          <w:b/>
+          <w:bCs/>
+        </w:rPr>
+        <w:t xml:space="preserve">10. Según las reglas del Shewa, ¿qué ocurre cuando dos </w:t>
+      </w:r>
+      <w:proofErr w:type="spellStart"/>
+      <w:r>
+        <w:rPr>
+          <w:b/>
+          <w:bCs/>
+        </w:rPr>
+        <w:t>Shewas</w:t>
+      </w:r>
+      <w:proofErr w:type="spellEnd"/>
+      <w:r>
+        <w:rPr>
+          <w:b/>
+          <w:bCs/>
+        </w:rPr>
+        <w:t xml:space="preserve"> vocales quedarían contiguos al principio de una palabra (ej. </w:t>
       </w:r>
       <w:r>
         <w:rPr>
@@ -636,23 +535,24 @@
         <w:rPr>
           <w:b/>
           <w:bCs/>
-          <w:lang w:val="en-US"/>
         </w:rPr>
         <w:t>)?</w:t>
       </w:r>
       <w:r>
-        <w:rPr>
-          <w:lang w:val="en-US"/>
-        </w:rPr>
         <w:br/>
         <w:t>a) La palabra se escribe igual</w:t>
       </w:r>
       <w:r>
-        <w:rPr>
-          <w:lang w:val="en-US"/>
-        </w:rPr>
-        <w:br/>
-        <w:t>b) El primer Shewa se convierte en Hireq (</w:t>
+        <w:br/>
+        <w:t xml:space="preserve">b) El primer Shewa se convierte en </w:t>
+      </w:r>
+      <w:proofErr w:type="spellStart"/>
+      <w:r>
+        <w:t>Hireq</w:t>
+      </w:r>
+      <w:proofErr w:type="spellEnd"/>
+      <w:r>
+        <w:t xml:space="preserve"> (</w:t>
       </w:r>
       <w:r>
         <w:rPr>
@@ -661,25 +561,26 @@
         <w:t>לִנְבִיאִים</w:t>
       </w:r>
       <w:r>
-        <w:rPr>
-          <w:lang w:val="en-US"/>
-        </w:rPr>
         <w:t>)</w:t>
       </w:r>
       <w:r>
-        <w:rPr>
-          <w:lang w:val="en-US"/>
-        </w:rPr>
-        <w:br/>
-        <w:t>c) El segundo Shewa se convierte en Qamets</w:t>
-      </w:r>
-      <w:r>
-        <w:rPr>
-          <w:lang w:val="en-US"/>
-        </w:rPr>
-        <w:br/>
-        <w:t>d) La palabra se escribe con dos Shewas</w:t>
-      </w:r>
+        <w:br/>
+        <w:t xml:space="preserve">c) El segundo Shewa se convierte en </w:t>
+      </w:r>
+      <w:proofErr w:type="spellStart"/>
+      <w:r>
+        <w:t>Qamets</w:t>
+      </w:r>
+      <w:proofErr w:type="spellEnd"/>
+      <w:r>
+        <w:br/>
+        <w:t xml:space="preserve">d) La palabra se escribe con dos </w:t>
+      </w:r>
+      <w:proofErr w:type="spellStart"/>
+      <w:r>
+        <w:t>Shewas</w:t>
+      </w:r>
+      <w:proofErr w:type="spellEnd"/>
     </w:p>
     <w:p>
       <w:pPr>
@@ -704,28 +605,128 @@
           <w:lang w:val="en-US"/>
         </w:rPr>
       </w:pPr>
-      <w:r>
-        <w:rPr>
-          <w:b/>
-          <w:bCs/>
-          <w:lang w:val="en-US"/>
-        </w:rPr>
-        <w:t>Parte II: Vocabulario (10 preguntas)</w:t>
-      </w:r>
-    </w:p>
-    <w:p>
-      <w:pPr>
-        <w:rPr>
-          <w:lang w:val="en-US"/>
-        </w:rPr>
-      </w:pPr>
-      <w:r>
-        <w:rPr>
-          <w:b/>
-          <w:bCs/>
-          <w:lang w:val="en-US"/>
-        </w:rPr>
-        <w:t xml:space="preserve">11. ¿Cuál es el significado de la palabra </w:t>
+      <w:proofErr w:type="spellStart"/>
+      <w:r>
+        <w:rPr>
+          <w:b/>
+          <w:bCs/>
+          <w:lang w:val="en-US"/>
+        </w:rPr>
+        <w:t>Parte</w:t>
+      </w:r>
+      <w:proofErr w:type="spellEnd"/>
+      <w:r>
+        <w:rPr>
+          <w:b/>
+          <w:bCs/>
+          <w:lang w:val="en-US"/>
+        </w:rPr>
+        <w:t xml:space="preserve"> II: </w:t>
+      </w:r>
+      <w:proofErr w:type="spellStart"/>
+      <w:r>
+        <w:rPr>
+          <w:b/>
+          <w:bCs/>
+          <w:lang w:val="en-US"/>
+        </w:rPr>
+        <w:t>Vocabulario</w:t>
+      </w:r>
+      <w:proofErr w:type="spellEnd"/>
+      <w:r>
+        <w:rPr>
+          <w:b/>
+          <w:bCs/>
+          <w:lang w:val="en-US"/>
+        </w:rPr>
+        <w:t xml:space="preserve"> (10 </w:t>
+      </w:r>
+      <w:proofErr w:type="spellStart"/>
+      <w:r>
+        <w:rPr>
+          <w:b/>
+          <w:bCs/>
+          <w:lang w:val="en-US"/>
+        </w:rPr>
+        <w:t>preguntas</w:t>
+      </w:r>
+      <w:proofErr w:type="spellEnd"/>
+      <w:r>
+        <w:rPr>
+          <w:b/>
+          <w:bCs/>
+          <w:lang w:val="en-US"/>
+        </w:rPr>
+        <w:t>)</w:t>
+      </w:r>
+    </w:p>
+    <w:p>
+      <w:pPr>
+        <w:rPr>
+          <w:lang w:val="en-US"/>
+        </w:rPr>
+      </w:pPr>
+      <w:r>
+        <w:rPr>
+          <w:b/>
+          <w:bCs/>
+          <w:lang w:val="en-US"/>
+        </w:rPr>
+        <w:t>11. ¿</w:t>
+      </w:r>
+      <w:proofErr w:type="spellStart"/>
+      <w:r>
+        <w:rPr>
+          <w:b/>
+          <w:bCs/>
+          <w:lang w:val="en-US"/>
+        </w:rPr>
+        <w:t>Cuál</w:t>
+      </w:r>
+      <w:proofErr w:type="spellEnd"/>
+      <w:r>
+        <w:rPr>
+          <w:b/>
+          <w:bCs/>
+          <w:lang w:val="en-US"/>
+        </w:rPr>
+        <w:t xml:space="preserve"> es el </w:t>
+      </w:r>
+      <w:proofErr w:type="spellStart"/>
+      <w:r>
+        <w:rPr>
+          <w:b/>
+          <w:bCs/>
+          <w:lang w:val="en-US"/>
+        </w:rPr>
+        <w:t>significado</w:t>
+      </w:r>
+      <w:proofErr w:type="spellEnd"/>
+      <w:r>
+        <w:rPr>
+          <w:b/>
+          <w:bCs/>
+          <w:lang w:val="en-US"/>
+        </w:rPr>
+        <w:t xml:space="preserve"> de la </w:t>
+      </w:r>
+      <w:proofErr w:type="spellStart"/>
+      <w:r>
+        <w:rPr>
+          <w:b/>
+          <w:bCs/>
+          <w:lang w:val="en-US"/>
+        </w:rPr>
+        <w:t>palabra</w:t>
+      </w:r>
+      <w:proofErr w:type="spellEnd"/>
+      <w:r>
+        <w:rPr>
+          <w:b/>
+          <w:bCs/>
+          <w:lang w:val="en-US"/>
+        </w:rPr>
+        <w:t xml:space="preserve"> </w:t>
       </w:r>
       <w:r>
         <w:rPr>
@@ -748,15 +749,31 @@
           <w:lang w:val="en-US"/>
         </w:rPr>
         <w:br/>
-        <w:t>a) Hermano</w:t>
-      </w:r>
-      <w:r>
-        <w:rPr>
-          <w:lang w:val="en-US"/>
-        </w:rPr>
-        <w:br/>
-        <w:t>b) Hijo</w:t>
-      </w:r>
+        <w:t xml:space="preserve">a) </w:t>
+      </w:r>
+      <w:proofErr w:type="spellStart"/>
+      <w:r>
+        <w:rPr>
+          <w:lang w:val="en-US"/>
+        </w:rPr>
+        <w:t>Hermano</w:t>
+      </w:r>
+      <w:proofErr w:type="spellEnd"/>
+      <w:r>
+        <w:rPr>
+          <w:lang w:val="en-US"/>
+        </w:rPr>
+        <w:br/>
+        <w:t xml:space="preserve">b) </w:t>
+      </w:r>
+      <w:proofErr w:type="spellStart"/>
+      <w:r>
+        <w:rPr>
+          <w:lang w:val="en-US"/>
+        </w:rPr>
+        <w:t>Hijo</w:t>
+      </w:r>
+      <w:proofErr w:type="spellEnd"/>
       <w:r>
         <w:rPr>
           <w:lang w:val="en-US"/>
@@ -769,22 +786,66 @@
           <w:lang w:val="en-US"/>
         </w:rPr>
         <w:br/>
-        <w:t>d) Señor</w:t>
-      </w:r>
-    </w:p>
-    <w:p>
-      <w:pPr>
-        <w:rPr>
-          <w:lang w:val="en-US"/>
-        </w:rPr>
-      </w:pPr>
-      <w:r>
-        <w:rPr>
-          <w:b/>
-          <w:bCs/>
-          <w:lang w:val="en-US"/>
-        </w:rPr>
-        <w:t xml:space="preserve">12. ¿Qué significa </w:t>
+        <w:t xml:space="preserve">d) </w:t>
+      </w:r>
+      <w:proofErr w:type="spellStart"/>
+      <w:r>
+        <w:rPr>
+          <w:lang w:val="en-US"/>
+        </w:rPr>
+        <w:t>Señor</w:t>
+      </w:r>
+      <w:proofErr w:type="spellEnd"/>
+    </w:p>
+    <w:p>
+      <w:pPr>
+        <w:rPr>
+          <w:lang w:val="en-US"/>
+        </w:rPr>
+      </w:pPr>
+      <w:r>
+        <w:rPr>
+          <w:b/>
+          <w:bCs/>
+          <w:lang w:val="en-US"/>
+        </w:rPr>
+        <w:t>12. ¿</w:t>
+      </w:r>
+      <w:proofErr w:type="spellStart"/>
+      <w:r>
+        <w:rPr>
+          <w:b/>
+          <w:bCs/>
+          <w:lang w:val="en-US"/>
+        </w:rPr>
+        <w:t>Qué</w:t>
+      </w:r>
+      <w:proofErr w:type="spellEnd"/>
+      <w:r>
+        <w:rPr>
+          <w:b/>
+          <w:bCs/>
+          <w:lang w:val="en-US"/>
+        </w:rPr>
+        <w:t xml:space="preserve"> </w:t>
+      </w:r>
+      <w:proofErr w:type="spellStart"/>
+      <w:r>
+        <w:rPr>
+          <w:b/>
+          <w:bCs/>
+          <w:lang w:val="en-US"/>
+        </w:rPr>
+        <w:t>significa</w:t>
+      </w:r>
+      <w:proofErr w:type="spellEnd"/>
+      <w:r>
+        <w:rPr>
+          <w:b/>
+          <w:bCs/>
+          <w:lang w:val="en-US"/>
+        </w:rPr>
+        <w:t xml:space="preserve"> </w:t>
       </w:r>
       <w:r>
         <w:rPr>
@@ -807,15 +868,31 @@
           <w:lang w:val="en-US"/>
         </w:rPr>
         <w:br/>
-        <w:t>a) Mujer</w:t>
-      </w:r>
-      <w:r>
-        <w:rPr>
-          <w:lang w:val="en-US"/>
-        </w:rPr>
-        <w:br/>
-        <w:t>b) Hombre, esposo</w:t>
-      </w:r>
+        <w:t xml:space="preserve">a) </w:t>
+      </w:r>
+      <w:proofErr w:type="spellStart"/>
+      <w:r>
+        <w:rPr>
+          <w:lang w:val="en-US"/>
+        </w:rPr>
+        <w:t>Mujer</w:t>
+      </w:r>
+      <w:proofErr w:type="spellEnd"/>
+      <w:r>
+        <w:rPr>
+          <w:lang w:val="en-US"/>
+        </w:rPr>
+        <w:br/>
+        <w:t xml:space="preserve">b) Hombre, </w:t>
+      </w:r>
+      <w:proofErr w:type="spellStart"/>
+      <w:r>
+        <w:rPr>
+          <w:lang w:val="en-US"/>
+        </w:rPr>
+        <w:t>esposo</w:t>
+      </w:r>
+      <w:proofErr w:type="spellEnd"/>
       <w:r>
         <w:rPr>
           <w:lang w:val="en-US"/>
@@ -843,7 +920,43 @@
           <w:bCs/>
           <w:lang w:val="en-US"/>
         </w:rPr>
-        <w:t xml:space="preserve">13. ¿Cuál es el significado de </w:t>
+        <w:t>13. ¿</w:t>
+      </w:r>
+      <w:proofErr w:type="spellStart"/>
+      <w:r>
+        <w:rPr>
+          <w:b/>
+          <w:bCs/>
+          <w:lang w:val="en-US"/>
+        </w:rPr>
+        <w:t>Cuál</w:t>
+      </w:r>
+      <w:proofErr w:type="spellEnd"/>
+      <w:r>
+        <w:rPr>
+          <w:b/>
+          <w:bCs/>
+          <w:lang w:val="en-US"/>
+        </w:rPr>
+        <w:t xml:space="preserve"> es el </w:t>
+      </w:r>
+      <w:proofErr w:type="spellStart"/>
+      <w:r>
+        <w:rPr>
+          <w:b/>
+          <w:bCs/>
+          <w:lang w:val="en-US"/>
+        </w:rPr>
+        <w:t>significado</w:t>
+      </w:r>
+      <w:proofErr w:type="spellEnd"/>
+      <w:r>
+        <w:rPr>
+          <w:b/>
+          <w:bCs/>
+          <w:lang w:val="en-US"/>
+        </w:rPr>
+        <w:t xml:space="preserve"> de </w:t>
       </w:r>
       <w:r>
         <w:rPr>
@@ -866,8 +979,16 @@
           <w:lang w:val="en-US"/>
         </w:rPr>
         <w:br/>
-        <w:t>a) Hijo</w:t>
-      </w:r>
+        <w:t xml:space="preserve">a) </w:t>
+      </w:r>
+      <w:proofErr w:type="spellStart"/>
+      <w:r>
+        <w:rPr>
+          <w:lang w:val="en-US"/>
+        </w:rPr>
+        <w:t>Hijo</w:t>
+      </w:r>
+      <w:proofErr w:type="spellEnd"/>
       <w:r>
         <w:rPr>
           <w:lang w:val="en-US"/>
@@ -879,8 +1000,16 @@
           <w:lang w:val="en-US"/>
         </w:rPr>
         <w:lastRenderedPageBreak/>
-        <w:t>b) Hija</w:t>
-      </w:r>
+        <w:t xml:space="preserve">b) </w:t>
+      </w:r>
+      <w:proofErr w:type="spellStart"/>
+      <w:r>
+        <w:rPr>
+          <w:lang w:val="en-US"/>
+        </w:rPr>
+        <w:t>Hija</w:t>
+      </w:r>
+      <w:proofErr w:type="spellEnd"/>
       <w:r>
         <w:rPr>
           <w:lang w:val="en-US"/>
@@ -893,22 +1022,48 @@
           <w:lang w:val="en-US"/>
         </w:rPr>
         <w:br/>
-        <w:t>d) Pacto</w:t>
-      </w:r>
-    </w:p>
-    <w:p>
-      <w:pPr>
-        <w:rPr>
-          <w:lang w:val="en-US"/>
-        </w:rPr>
-      </w:pPr>
-      <w:r>
-        <w:rPr>
-          <w:b/>
-          <w:bCs/>
-          <w:lang w:val="en-US"/>
-        </w:rPr>
-        <w:t xml:space="preserve">14. La palabra </w:t>
+        <w:t xml:space="preserve">d) </w:t>
+      </w:r>
+      <w:proofErr w:type="spellStart"/>
+      <w:r>
+        <w:rPr>
+          <w:lang w:val="en-US"/>
+        </w:rPr>
+        <w:t>Pacto</w:t>
+      </w:r>
+      <w:proofErr w:type="spellEnd"/>
+    </w:p>
+    <w:p>
+      <w:pPr>
+        <w:rPr>
+          <w:lang w:val="en-US"/>
+        </w:rPr>
+      </w:pPr>
+      <w:r>
+        <w:rPr>
+          <w:b/>
+          <w:bCs/>
+          <w:lang w:val="en-US"/>
+        </w:rPr>
+        <w:t xml:space="preserve">14. La </w:t>
+      </w:r>
+      <w:proofErr w:type="spellStart"/>
+      <w:r>
+        <w:rPr>
+          <w:b/>
+          <w:bCs/>
+          <w:lang w:val="en-US"/>
+        </w:rPr>
+        <w:t>palabra</w:t>
+      </w:r>
+      <w:proofErr w:type="spellEnd"/>
+      <w:r>
+        <w:rPr>
+          <w:b/>
+          <w:bCs/>
+          <w:lang w:val="en-US"/>
+        </w:rPr>
+        <w:t xml:space="preserve"> </w:t>
       </w:r>
       <w:r>
         <w:rPr>
@@ -924,50 +1079,180 @@
           <w:bCs/>
           <w:lang w:val="en-US"/>
         </w:rPr>
-        <w:t xml:space="preserve"> (néfeš) significa:</w:t>
-      </w:r>
-      <w:r>
-        <w:rPr>
-          <w:lang w:val="en-US"/>
-        </w:rPr>
-        <w:br/>
-        <w:t>a) Cabeza</w:t>
-      </w:r>
-      <w:r>
-        <w:rPr>
-          <w:lang w:val="en-US"/>
-        </w:rPr>
-        <w:br/>
-        <w:t>b) Alma, vida, persona</w:t>
-      </w:r>
-      <w:r>
-        <w:rPr>
-          <w:lang w:val="en-US"/>
-        </w:rPr>
-        <w:br/>
-        <w:t>c) Profeta</w:t>
-      </w:r>
-      <w:r>
-        <w:rPr>
-          <w:lang w:val="en-US"/>
-        </w:rPr>
-        <w:br/>
-        <w:t>d) Voz</w:t>
-      </w:r>
-    </w:p>
-    <w:p>
-      <w:pPr>
-        <w:rPr>
-          <w:lang w:val="en-US"/>
-        </w:rPr>
-      </w:pPr>
-      <w:r>
-        <w:rPr>
-          <w:b/>
-          <w:bCs/>
-          <w:lang w:val="en-US"/>
-        </w:rPr>
-        <w:t xml:space="preserve">15. ¿Qué significa el término </w:t>
+        <w:t xml:space="preserve"> (</w:t>
+      </w:r>
+      <w:proofErr w:type="spellStart"/>
+      <w:r>
+        <w:rPr>
+          <w:b/>
+          <w:bCs/>
+          <w:lang w:val="en-US"/>
+        </w:rPr>
+        <w:t>néfeš</w:t>
+      </w:r>
+      <w:proofErr w:type="spellEnd"/>
+      <w:r>
+        <w:rPr>
+          <w:b/>
+          <w:bCs/>
+          <w:lang w:val="en-US"/>
+        </w:rPr>
+        <w:t xml:space="preserve">) </w:t>
+      </w:r>
+      <w:proofErr w:type="spellStart"/>
+      <w:r>
+        <w:rPr>
+          <w:b/>
+          <w:bCs/>
+          <w:lang w:val="en-US"/>
+        </w:rPr>
+        <w:t>significa</w:t>
+      </w:r>
+      <w:proofErr w:type="spellEnd"/>
+      <w:proofErr w:type="gramStart"/>
+      <w:r>
+        <w:rPr>
+          <w:b/>
+          <w:bCs/>
+          <w:lang w:val="en-US"/>
+        </w:rPr>
+        <w:t>:</w:t>
+      </w:r>
+      <w:proofErr w:type="gramEnd"/>
+      <w:r>
+        <w:rPr>
+          <w:lang w:val="en-US"/>
+        </w:rPr>
+        <w:br/>
+        <w:t xml:space="preserve">a) </w:t>
+      </w:r>
+      <w:proofErr w:type="spellStart"/>
+      <w:r>
+        <w:rPr>
+          <w:lang w:val="en-US"/>
+        </w:rPr>
+        <w:t>Cabeza</w:t>
+      </w:r>
+      <w:proofErr w:type="spellEnd"/>
+      <w:r>
+        <w:rPr>
+          <w:lang w:val="en-US"/>
+        </w:rPr>
+        <w:br/>
+        <w:t xml:space="preserve">b) Alma, </w:t>
+      </w:r>
+      <w:proofErr w:type="spellStart"/>
+      <w:r>
+        <w:rPr>
+          <w:lang w:val="en-US"/>
+        </w:rPr>
+        <w:t>vida</w:t>
+      </w:r>
+      <w:proofErr w:type="spellEnd"/>
+      <w:r>
+        <w:rPr>
+          <w:lang w:val="en-US"/>
+        </w:rPr>
+        <w:t>, persona</w:t>
+      </w:r>
+      <w:r>
+        <w:rPr>
+          <w:lang w:val="en-US"/>
+        </w:rPr>
+        <w:br/>
+        <w:t xml:space="preserve">c) </w:t>
+      </w:r>
+      <w:proofErr w:type="spellStart"/>
+      <w:r>
+        <w:rPr>
+          <w:lang w:val="en-US"/>
+        </w:rPr>
+        <w:t>Profeta</w:t>
+      </w:r>
+      <w:proofErr w:type="spellEnd"/>
+      <w:r>
+        <w:rPr>
+          <w:lang w:val="en-US"/>
+        </w:rPr>
+        <w:br/>
+        <w:t xml:space="preserve">d) </w:t>
+      </w:r>
+      <w:proofErr w:type="spellStart"/>
+      <w:r>
+        <w:rPr>
+          <w:lang w:val="en-US"/>
+        </w:rPr>
+        <w:t>Voz</w:t>
+      </w:r>
+      <w:proofErr w:type="spellEnd"/>
+    </w:p>
+    <w:p>
+      <w:pPr>
+        <w:rPr>
+          <w:lang w:val="en-US"/>
+        </w:rPr>
+      </w:pPr>
+      <w:r>
+        <w:rPr>
+          <w:b/>
+          <w:bCs/>
+          <w:lang w:val="en-US"/>
+        </w:rPr>
+        <w:t>15. ¿</w:t>
+      </w:r>
+      <w:proofErr w:type="spellStart"/>
+      <w:r>
+        <w:rPr>
+          <w:b/>
+          <w:bCs/>
+          <w:lang w:val="en-US"/>
+        </w:rPr>
+        <w:t>Qué</w:t>
+      </w:r>
+      <w:proofErr w:type="spellEnd"/>
+      <w:r>
+        <w:rPr>
+          <w:b/>
+          <w:bCs/>
+          <w:lang w:val="en-US"/>
+        </w:rPr>
+        <w:t xml:space="preserve"> </w:t>
+      </w:r>
+      <w:proofErr w:type="spellStart"/>
+      <w:r>
+        <w:rPr>
+          <w:b/>
+          <w:bCs/>
+          <w:lang w:val="en-US"/>
+        </w:rPr>
+        <w:t>significa</w:t>
+      </w:r>
+      <w:proofErr w:type="spellEnd"/>
+      <w:r>
+        <w:rPr>
+          <w:b/>
+          <w:bCs/>
+          <w:lang w:val="en-US"/>
+        </w:rPr>
+        <w:t xml:space="preserve"> el </w:t>
+      </w:r>
+      <w:proofErr w:type="spellStart"/>
+      <w:r>
+        <w:rPr>
+          <w:b/>
+          <w:bCs/>
+          <w:lang w:val="en-US"/>
+        </w:rPr>
+        <w:t>término</w:t>
+      </w:r>
+      <w:proofErr w:type="spellEnd"/>
+      <w:r>
+        <w:rPr>
+          <w:b/>
+          <w:bCs/>
+          <w:lang w:val="en-US"/>
+        </w:rPr>
+        <w:t xml:space="preserve"> </w:t>
       </w:r>
       <w:r>
         <w:rPr>
@@ -1011,22 +1296,66 @@
           <w:lang w:val="en-US"/>
         </w:rPr>
         <w:br/>
-        <w:t>d) Ojo</w:t>
-      </w:r>
-    </w:p>
-    <w:p>
-      <w:pPr>
-        <w:rPr>
-          <w:lang w:val="en-US"/>
-        </w:rPr>
-      </w:pPr>
-      <w:r>
-        <w:rPr>
-          <w:b/>
-          <w:bCs/>
-          <w:lang w:val="en-US"/>
-        </w:rPr>
-        <w:t xml:space="preserve">16. ¿Cuál es el significado de </w:t>
+        <w:t xml:space="preserve">d) </w:t>
+      </w:r>
+      <w:proofErr w:type="spellStart"/>
+      <w:r>
+        <w:rPr>
+          <w:lang w:val="en-US"/>
+        </w:rPr>
+        <w:t>Ojo</w:t>
+      </w:r>
+      <w:proofErr w:type="spellEnd"/>
+    </w:p>
+    <w:p>
+      <w:pPr>
+        <w:rPr>
+          <w:lang w:val="en-US"/>
+        </w:rPr>
+      </w:pPr>
+      <w:r>
+        <w:rPr>
+          <w:b/>
+          <w:bCs/>
+          <w:lang w:val="en-US"/>
+        </w:rPr>
+        <w:t>16. ¿</w:t>
+      </w:r>
+      <w:proofErr w:type="spellStart"/>
+      <w:r>
+        <w:rPr>
+          <w:b/>
+          <w:bCs/>
+          <w:lang w:val="en-US"/>
+        </w:rPr>
+        <w:t>Cuál</w:t>
+      </w:r>
+      <w:proofErr w:type="spellEnd"/>
+      <w:r>
+        <w:rPr>
+          <w:b/>
+          <w:bCs/>
+          <w:lang w:val="en-US"/>
+        </w:rPr>
+        <w:t xml:space="preserve"> es el </w:t>
+      </w:r>
+      <w:proofErr w:type="spellStart"/>
+      <w:r>
+        <w:rPr>
+          <w:b/>
+          <w:bCs/>
+          <w:lang w:val="en-US"/>
+        </w:rPr>
+        <w:t>significado</w:t>
+      </w:r>
+      <w:proofErr w:type="spellEnd"/>
+      <w:r>
+        <w:rPr>
+          <w:b/>
+          <w:bCs/>
+          <w:lang w:val="en-US"/>
+        </w:rPr>
+        <w:t xml:space="preserve"> de </w:t>
       </w:r>
       <w:r>
         <w:rPr>
@@ -1049,15 +1378,31 @@
           <w:lang w:val="en-US"/>
         </w:rPr>
         <w:br/>
-        <w:t>a) Ley, instrucción</w:t>
-      </w:r>
-      <w:r>
-        <w:rPr>
-          <w:lang w:val="en-US"/>
-        </w:rPr>
-        <w:br/>
-        <w:t>b) Sacerdote</w:t>
-      </w:r>
+        <w:t xml:space="preserve">a) Ley, </w:t>
+      </w:r>
+      <w:proofErr w:type="spellStart"/>
+      <w:r>
+        <w:rPr>
+          <w:lang w:val="en-US"/>
+        </w:rPr>
+        <w:t>instrucción</w:t>
+      </w:r>
+      <w:proofErr w:type="spellEnd"/>
+      <w:r>
+        <w:rPr>
+          <w:lang w:val="en-US"/>
+        </w:rPr>
+        <w:br/>
+        <w:t xml:space="preserve">b) </w:t>
+      </w:r>
+      <w:proofErr w:type="spellStart"/>
+      <w:r>
+        <w:rPr>
+          <w:lang w:val="en-US"/>
+        </w:rPr>
+        <w:t>Sacerdote</w:t>
+      </w:r>
+      <w:proofErr w:type="spellEnd"/>
       <w:r>
         <w:rPr>
           <w:lang w:val="en-US"/>
@@ -1070,22 +1415,48 @@
           <w:lang w:val="en-US"/>
         </w:rPr>
         <w:br/>
-        <w:t>d) Libro</w:t>
-      </w:r>
-    </w:p>
-    <w:p>
-      <w:pPr>
-        <w:rPr>
-          <w:lang w:val="en-US"/>
-        </w:rPr>
-      </w:pPr>
-      <w:r>
-        <w:rPr>
-          <w:b/>
-          <w:bCs/>
-          <w:lang w:val="en-US"/>
-        </w:rPr>
-        <w:t xml:space="preserve">17. La palabra </w:t>
+        <w:t xml:space="preserve">d) </w:t>
+      </w:r>
+      <w:proofErr w:type="spellStart"/>
+      <w:r>
+        <w:rPr>
+          <w:lang w:val="en-US"/>
+        </w:rPr>
+        <w:t>Libro</w:t>
+      </w:r>
+      <w:proofErr w:type="spellEnd"/>
+    </w:p>
+    <w:p>
+      <w:pPr>
+        <w:rPr>
+          <w:lang w:val="en-US"/>
+        </w:rPr>
+      </w:pPr>
+      <w:r>
+        <w:rPr>
+          <w:b/>
+          <w:bCs/>
+          <w:lang w:val="en-US"/>
+        </w:rPr>
+        <w:t xml:space="preserve">17. La </w:t>
+      </w:r>
+      <w:proofErr w:type="spellStart"/>
+      <w:r>
+        <w:rPr>
+          <w:b/>
+          <w:bCs/>
+          <w:lang w:val="en-US"/>
+        </w:rPr>
+        <w:t>palabra</w:t>
+      </w:r>
+      <w:proofErr w:type="spellEnd"/>
+      <w:r>
+        <w:rPr>
+          <w:b/>
+          <w:bCs/>
+          <w:lang w:val="en-US"/>
+        </w:rPr>
+        <w:t xml:space="preserve"> </w:t>
       </w:r>
       <w:r>
         <w:rPr>
@@ -1101,15 +1472,61 @@
           <w:bCs/>
           <w:lang w:val="en-US"/>
         </w:rPr>
-        <w:t xml:space="preserve"> (máyim) significa:</w:t>
-      </w:r>
-      <w:r>
-        <w:rPr>
-          <w:lang w:val="en-US"/>
-        </w:rPr>
-        <w:br/>
-        <w:t>a) Cielo</w:t>
-      </w:r>
+        <w:t xml:space="preserve"> (</w:t>
+      </w:r>
+      <w:proofErr w:type="spellStart"/>
+      <w:r>
+        <w:rPr>
+          <w:b/>
+          <w:bCs/>
+          <w:lang w:val="en-US"/>
+        </w:rPr>
+        <w:t>máyim</w:t>
+      </w:r>
+      <w:proofErr w:type="spellEnd"/>
+      <w:r>
+        <w:rPr>
+          <w:b/>
+          <w:bCs/>
+          <w:lang w:val="en-US"/>
+        </w:rPr>
+        <w:t xml:space="preserve">) </w:t>
+      </w:r>
+      <w:proofErr w:type="spellStart"/>
+      <w:r>
+        <w:rPr>
+          <w:b/>
+          <w:bCs/>
+          <w:lang w:val="en-US"/>
+        </w:rPr>
+        <w:t>significa</w:t>
+      </w:r>
+      <w:proofErr w:type="spellEnd"/>
+      <w:proofErr w:type="gramStart"/>
+      <w:r>
+        <w:rPr>
+          <w:b/>
+          <w:bCs/>
+          <w:lang w:val="en-US"/>
+        </w:rPr>
+        <w:t>:</w:t>
+      </w:r>
+      <w:proofErr w:type="gramEnd"/>
+      <w:r>
+        <w:rPr>
+          <w:lang w:val="en-US"/>
+        </w:rPr>
+        <w:br/>
+        <w:t xml:space="preserve">a) </w:t>
+      </w:r>
+      <w:proofErr w:type="spellStart"/>
+      <w:r>
+        <w:rPr>
+          <w:lang w:val="en-US"/>
+        </w:rPr>
+        <w:t>Cielo</w:t>
+      </w:r>
+      <w:proofErr w:type="spellEnd"/>
       <w:r>
         <w:rPr>
           <w:lang w:val="en-US"/>
@@ -1122,29 +1539,81 @@
           <w:lang w:val="en-US"/>
         </w:rPr>
         <w:br/>
-        <w:t>c) Egipto</w:t>
-      </w:r>
-      <w:r>
-        <w:rPr>
-          <w:lang w:val="en-US"/>
-        </w:rPr>
-        <w:br/>
-        <w:t>d) Día</w:t>
-      </w:r>
-    </w:p>
-    <w:p>
-      <w:pPr>
-        <w:rPr>
-          <w:lang w:val="en-US"/>
-        </w:rPr>
-      </w:pPr>
-      <w:r>
-        <w:rPr>
-          <w:b/>
-          <w:bCs/>
-          <w:lang w:val="en-US"/>
-        </w:rPr>
-        <w:t xml:space="preserve">18. ¿Qué significa </w:t>
+        <w:t xml:space="preserve">c) </w:t>
+      </w:r>
+      <w:proofErr w:type="spellStart"/>
+      <w:r>
+        <w:rPr>
+          <w:lang w:val="en-US"/>
+        </w:rPr>
+        <w:t>Egipto</w:t>
+      </w:r>
+      <w:proofErr w:type="spellEnd"/>
+      <w:r>
+        <w:rPr>
+          <w:lang w:val="en-US"/>
+        </w:rPr>
+        <w:br/>
+        <w:t xml:space="preserve">d) </w:t>
+      </w:r>
+      <w:proofErr w:type="spellStart"/>
+      <w:r>
+        <w:rPr>
+          <w:lang w:val="en-US"/>
+        </w:rPr>
+        <w:t>Día</w:t>
+      </w:r>
+      <w:proofErr w:type="spellEnd"/>
+    </w:p>
+    <w:p>
+      <w:pPr>
+        <w:rPr>
+          <w:lang w:val="en-US"/>
+        </w:rPr>
+      </w:pPr>
+      <w:r>
+        <w:rPr>
+          <w:b/>
+          <w:bCs/>
+          <w:lang w:val="en-US"/>
+        </w:rPr>
+        <w:t>18. ¿</w:t>
+      </w:r>
+      <w:proofErr w:type="spellStart"/>
+      <w:r>
+        <w:rPr>
+          <w:b/>
+          <w:bCs/>
+          <w:lang w:val="en-US"/>
+        </w:rPr>
+        <w:t>Qué</w:t>
+      </w:r>
+      <w:proofErr w:type="spellEnd"/>
+      <w:r>
+        <w:rPr>
+          <w:b/>
+          <w:bCs/>
+          <w:lang w:val="en-US"/>
+        </w:rPr>
+        <w:t xml:space="preserve"> </w:t>
+      </w:r>
+      <w:proofErr w:type="spellStart"/>
+      <w:r>
+        <w:rPr>
+          <w:b/>
+          <w:bCs/>
+          <w:lang w:val="en-US"/>
+        </w:rPr>
+        <w:t>significa</w:t>
+      </w:r>
+      <w:proofErr w:type="spellEnd"/>
+      <w:r>
+        <w:rPr>
+          <w:b/>
+          <w:bCs/>
+          <w:lang w:val="en-US"/>
+        </w:rPr>
+        <w:t xml:space="preserve"> </w:t>
       </w:r>
       <w:r>
         <w:rPr>
@@ -1160,7 +1629,25 @@
           <w:bCs/>
           <w:lang w:val="en-US"/>
         </w:rPr>
-        <w:t xml:space="preserve"> (rōʾš)?</w:t>
+        <w:t xml:space="preserve"> (</w:t>
+      </w:r>
+      <w:proofErr w:type="spellStart"/>
+      <w:r>
+        <w:rPr>
+          <w:b/>
+          <w:bCs/>
+          <w:lang w:val="en-US"/>
+        </w:rPr>
+        <w:t>rōʾš</w:t>
+      </w:r>
+      <w:proofErr w:type="spellEnd"/>
+      <w:r>
+        <w:rPr>
+          <w:b/>
+          <w:bCs/>
+          <w:lang w:val="en-US"/>
+        </w:rPr>
+        <w:t>)?</w:t>
       </w:r>
       <w:r>
         <w:rPr>
@@ -1181,29 +1668,95 @@
           <w:lang w:val="en-US"/>
         </w:rPr>
         <w:br/>
-        <w:t>c) Cabeza, jefe</w:t>
-      </w:r>
-      <w:r>
-        <w:rPr>
-          <w:lang w:val="en-US"/>
-        </w:rPr>
-        <w:br/>
-        <w:t>d) Corazón</w:t>
-      </w:r>
-    </w:p>
-    <w:p>
-      <w:pPr>
-        <w:rPr>
-          <w:lang w:val="en-US"/>
-        </w:rPr>
-      </w:pPr>
-      <w:r>
-        <w:rPr>
-          <w:b/>
-          <w:bCs/>
-          <w:lang w:val="en-US"/>
-        </w:rPr>
-        <w:t xml:space="preserve">19. ¿Cuál es el significado de </w:t>
+        <w:t xml:space="preserve">c) </w:t>
+      </w:r>
+      <w:proofErr w:type="spellStart"/>
+      <w:r>
+        <w:rPr>
+          <w:lang w:val="en-US"/>
+        </w:rPr>
+        <w:t>Cabeza</w:t>
+      </w:r>
+      <w:proofErr w:type="spellEnd"/>
+      <w:r>
+        <w:rPr>
+          <w:lang w:val="en-US"/>
+        </w:rPr>
+        <w:t xml:space="preserve">, </w:t>
+      </w:r>
+      <w:proofErr w:type="spellStart"/>
+      <w:r>
+        <w:rPr>
+          <w:lang w:val="en-US"/>
+        </w:rPr>
+        <w:t>jefe</w:t>
+      </w:r>
+      <w:proofErr w:type="spellEnd"/>
+      <w:r>
+        <w:rPr>
+          <w:lang w:val="en-US"/>
+        </w:rPr>
+        <w:br/>
+        <w:t xml:space="preserve">d) </w:t>
+      </w:r>
+      <w:proofErr w:type="spellStart"/>
+      <w:r>
+        <w:rPr>
+          <w:lang w:val="en-US"/>
+        </w:rPr>
+        <w:t>Corazón</w:t>
+      </w:r>
+      <w:proofErr w:type="spellEnd"/>
+    </w:p>
+    <w:p>
+      <w:pPr>
+        <w:rPr>
+          <w:lang w:val="en-US"/>
+        </w:rPr>
+      </w:pPr>
+      <w:r>
+        <w:rPr>
+          <w:b/>
+          <w:bCs/>
+          <w:lang w:val="en-US"/>
+        </w:rPr>
+        <w:t>19. ¿</w:t>
+      </w:r>
+      <w:proofErr w:type="spellStart"/>
+      <w:r>
+        <w:rPr>
+          <w:b/>
+          <w:bCs/>
+          <w:lang w:val="en-US"/>
+        </w:rPr>
+        <w:t>Cuál</w:t>
+      </w:r>
+      <w:proofErr w:type="spellEnd"/>
+      <w:r>
+        <w:rPr>
+          <w:b/>
+          <w:bCs/>
+          <w:lang w:val="en-US"/>
+        </w:rPr>
+        <w:t xml:space="preserve"> es el </w:t>
+      </w:r>
+      <w:proofErr w:type="spellStart"/>
+      <w:r>
+        <w:rPr>
+          <w:b/>
+          <w:bCs/>
+          <w:lang w:val="en-US"/>
+        </w:rPr>
+        <w:t>significado</w:t>
+      </w:r>
+      <w:proofErr w:type="spellEnd"/>
+      <w:r>
+        <w:rPr>
+          <w:b/>
+          <w:bCs/>
+          <w:lang w:val="en-US"/>
+        </w:rPr>
+        <w:t xml:space="preserve"> de </w:t>
       </w:r>
       <w:r>
         <w:rPr>
@@ -1233,36 +1786,78 @@
           <w:lang w:val="en-US"/>
         </w:rPr>
         <w:br/>
-        <w:t>b) Sacerdote</w:t>
-      </w:r>
-      <w:r>
-        <w:rPr>
-          <w:lang w:val="en-US"/>
-        </w:rPr>
-        <w:br/>
-        <w:t>c) Profeta</w:t>
-      </w:r>
-      <w:r>
-        <w:rPr>
-          <w:lang w:val="en-US"/>
-        </w:rPr>
-        <w:br/>
-        <w:t>d) Ángel</w:t>
-      </w:r>
-    </w:p>
-    <w:p>
-      <w:pPr>
-        <w:rPr>
-          <w:lang w:val="en-US"/>
-        </w:rPr>
-      </w:pPr>
-      <w:r>
-        <w:rPr>
-          <w:b/>
-          <w:bCs/>
-          <w:lang w:val="en-US"/>
-        </w:rPr>
-        <w:t xml:space="preserve">20. La palabra </w:t>
+        <w:t xml:space="preserve">b) </w:t>
+      </w:r>
+      <w:proofErr w:type="spellStart"/>
+      <w:r>
+        <w:rPr>
+          <w:lang w:val="en-US"/>
+        </w:rPr>
+        <w:t>Sacerdote</w:t>
+      </w:r>
+      <w:proofErr w:type="spellEnd"/>
+      <w:r>
+        <w:rPr>
+          <w:lang w:val="en-US"/>
+        </w:rPr>
+        <w:br/>
+        <w:t xml:space="preserve">c) </w:t>
+      </w:r>
+      <w:proofErr w:type="spellStart"/>
+      <w:r>
+        <w:rPr>
+          <w:lang w:val="en-US"/>
+        </w:rPr>
+        <w:t>Profeta</w:t>
+      </w:r>
+      <w:proofErr w:type="spellEnd"/>
+      <w:r>
+        <w:rPr>
+          <w:lang w:val="en-US"/>
+        </w:rPr>
+        <w:br/>
+        <w:t xml:space="preserve">d) </w:t>
+      </w:r>
+      <w:proofErr w:type="spellStart"/>
+      <w:r>
+        <w:rPr>
+          <w:lang w:val="en-US"/>
+        </w:rPr>
+        <w:t>Ángel</w:t>
+      </w:r>
+      <w:proofErr w:type="spellEnd"/>
+    </w:p>
+    <w:p>
+      <w:pPr>
+        <w:rPr>
+          <w:lang w:val="en-US"/>
+        </w:rPr>
+      </w:pPr>
+      <w:r>
+        <w:rPr>
+          <w:b/>
+          <w:bCs/>
+          <w:lang w:val="en-US"/>
+        </w:rPr>
+        <w:t xml:space="preserve">20. La </w:t>
+      </w:r>
+      <w:proofErr w:type="spellStart"/>
+      <w:r>
+        <w:rPr>
+          <w:b/>
+          <w:bCs/>
+          <w:lang w:val="en-US"/>
+        </w:rPr>
+        <w:t>palabra</w:t>
+      </w:r>
+      <w:proofErr w:type="spellEnd"/>
+      <w:r>
+        <w:rPr>
+          <w:b/>
+          <w:bCs/>
+          <w:lang w:val="en-US"/>
+        </w:rPr>
+        <w:t xml:space="preserve"> </w:t>
       </w:r>
       <w:r>
         <w:rPr>
@@ -1278,15 +1873,67 @@
           <w:bCs/>
           <w:lang w:val="en-US"/>
         </w:rPr>
-        <w:t xml:space="preserve"> (ʾāḥ) significa:</w:t>
-      </w:r>
-      <w:r>
-        <w:rPr>
-          <w:lang w:val="en-US"/>
-        </w:rPr>
-        <w:br/>
-        <w:t>a) Hermano</w:t>
-      </w:r>
+        <w:t xml:space="preserve"> (</w:t>
+      </w:r>
+      <w:proofErr w:type="spellStart"/>
+      <w:r>
+        <w:rPr>
+          <w:b/>
+          <w:bCs/>
+          <w:lang w:val="en-US"/>
+        </w:rPr>
+        <w:t>ʾāḥ</w:t>
+      </w:r>
+      <w:proofErr w:type="spellEnd"/>
+      <w:r>
+        <w:rPr>
+          <w:b/>
+          <w:bCs/>
+          <w:lang w:val="en-US"/>
+        </w:rPr>
+        <w:t xml:space="preserve">) </w:t>
+      </w:r>
+      <w:proofErr w:type="spellStart"/>
+      <w:r>
+        <w:rPr>
+          <w:b/>
+          <w:bCs/>
+          <w:lang w:val="en-US"/>
+        </w:rPr>
+        <w:t>significa</w:t>
+      </w:r>
+      <w:proofErr w:type="spellEnd"/>
+      <w:proofErr w:type="gramStart"/>
+      <w:r>
+        <w:rPr>
+          <w:b/>
+          <w:bCs/>
+          <w:lang w:val="en-US"/>
+        </w:rPr>
+        <w:t>:</w:t>
+      </w:r>
+      <w:proofErr w:type="gramEnd"/>
+      <w:r>
+        <w:rPr>
+          <w:lang w:val="en-US"/>
+        </w:rPr>
+        <w:br/>
+      </w:r>
+      <w:bookmarkStart w:id="0" w:name="_GoBack"/>
+      <w:r>
+        <w:rPr>
+          <w:lang w:val="en-US"/>
+        </w:rPr>
+        <w:t xml:space="preserve">a) </w:t>
+      </w:r>
+      <w:proofErr w:type="spellStart"/>
+      <w:r>
+        <w:rPr>
+          <w:lang w:val="en-US"/>
+        </w:rPr>
+        <w:t>Hermano</w:t>
+      </w:r>
+      <w:proofErr w:type="spellEnd"/>
       <w:r>
         <w:rPr>
           <w:lang w:val="en-US"/>
@@ -1305,8 +1952,16 @@
           <w:lang w:val="en-US"/>
         </w:rPr>
         <w:lastRenderedPageBreak/>
-        <w:t>c) Tío</w:t>
-      </w:r>
+        <w:t xml:space="preserve">c) </w:t>
+      </w:r>
+      <w:proofErr w:type="spellStart"/>
+      <w:r>
+        <w:rPr>
+          <w:lang w:val="en-US"/>
+        </w:rPr>
+        <w:t>Tío</w:t>
+      </w:r>
+      <w:proofErr w:type="spellEnd"/>
       <w:r>
         <w:rPr>
           <w:lang w:val="en-US"/>
@@ -1314,6 +1969,7 @@
         <w:br/>
         <w:t>d) Amigo</w:t>
       </w:r>
+      <w:bookmarkEnd w:id="0"/>
     </w:p>
     <w:p>
       <w:pPr>
@@ -1338,30 +1994,68 @@
           <w:lang w:val="en-US"/>
         </w:rPr>
       </w:pPr>
-      <w:r>
-        <w:rPr>
-          <w:b/>
-          <w:bCs/>
-          <w:lang w:val="en-US"/>
-        </w:rPr>
-        <w:t>Respuestas correctas:</w:t>
-      </w:r>
-    </w:p>
-    <w:p>
-      <w:pPr>
-        <w:rPr>
-          <w:b/>
-          <w:bCs/>
-          <w:lang w:val="en-US"/>
-        </w:rPr>
-      </w:pPr>
-      <w:r>
-        <w:rPr>
-          <w:b/>
-          <w:bCs/>
-          <w:lang w:val="en-US"/>
-        </w:rPr>
-        <w:t>Gramática:</w:t>
+      <w:proofErr w:type="spellStart"/>
+      <w:r>
+        <w:rPr>
+          <w:b/>
+          <w:bCs/>
+          <w:lang w:val="en-US"/>
+        </w:rPr>
+        <w:t>Respuestas</w:t>
+      </w:r>
+      <w:proofErr w:type="spellEnd"/>
+      <w:r>
+        <w:rPr>
+          <w:b/>
+          <w:bCs/>
+          <w:lang w:val="en-US"/>
+        </w:rPr>
+        <w:t xml:space="preserve"> </w:t>
+      </w:r>
+      <w:proofErr w:type="spellStart"/>
+      <w:r>
+        <w:rPr>
+          <w:b/>
+          <w:bCs/>
+          <w:lang w:val="en-US"/>
+        </w:rPr>
+        <w:t>correctas</w:t>
+      </w:r>
+      <w:proofErr w:type="spellEnd"/>
+      <w:r>
+        <w:rPr>
+          <w:b/>
+          <w:bCs/>
+          <w:lang w:val="en-US"/>
+        </w:rPr>
+        <w:t>:</w:t>
+      </w:r>
+    </w:p>
+    <w:p>
+      <w:pPr>
+        <w:rPr>
+          <w:b/>
+          <w:bCs/>
+          <w:lang w:val="en-US"/>
+        </w:rPr>
+      </w:pPr>
+      <w:proofErr w:type="spellStart"/>
+      <w:r>
+        <w:rPr>
+          <w:b/>
+          <w:bCs/>
+          <w:lang w:val="en-US"/>
+        </w:rPr>
+        <w:t>Gramática</w:t>
+      </w:r>
+      <w:proofErr w:type="spellEnd"/>
+      <w:r>
+        <w:rPr>
+          <w:b/>
+          <w:bCs/>
+          <w:lang w:val="en-US"/>
+        </w:rPr>
+        <w:t>:</w:t>
       </w:r>
     </w:p>
     <w:p>
@@ -1370,22 +2064,15 @@
           <w:ilvl w:val="0"/>
           <w:numId w:val="1"/>
         </w:numPr>
-        <w:rPr>
-          <w:lang w:val="en-US"/>
-        </w:rPr>
-      </w:pPr>
-      <w:r>
-        <w:rPr>
-          <w:b/>
-          <w:bCs/>
-          <w:lang w:val="en-US"/>
+      </w:pPr>
+      <w:r>
+        <w:rPr>
+          <w:b/>
+          <w:bCs/>
         </w:rPr>
         <w:t>b</w:t>
       </w:r>
       <w:r>
-        <w:rPr>
-          <w:lang w:val="en-US"/>
-        </w:rPr>
         <w:t> (Los sustantivos pueden ser singular, plural o dual)</w:t>
       </w:r>
     </w:p>
@@ -1522,7 +2209,35 @@
         <w:rPr>
           <w:lang w:val="en-US"/>
         </w:rPr>
-        <w:t xml:space="preserve"> es femenino sin terminación)</w:t>
+        <w:t xml:space="preserve"> es </w:t>
+      </w:r>
+      <w:proofErr w:type="spellStart"/>
+      <w:r>
+        <w:rPr>
+          <w:lang w:val="en-US"/>
+        </w:rPr>
+        <w:t>femenino</w:t>
+      </w:r>
+      <w:proofErr w:type="spellEnd"/>
+      <w:r>
+        <w:rPr>
+          <w:lang w:val="en-US"/>
+        </w:rPr>
+        <w:t xml:space="preserve"> sin </w:t>
+      </w:r>
+      <w:proofErr w:type="spellStart"/>
+      <w:r>
+        <w:rPr>
+          <w:lang w:val="en-US"/>
+        </w:rPr>
+        <w:t>terminación</w:t>
+      </w:r>
+      <w:proofErr w:type="spellEnd"/>
+      <w:r>
+        <w:rPr>
+          <w:lang w:val="en-US"/>
+        </w:rPr>
+        <w:t>)</w:t>
       </w:r>
     </w:p>
     <w:p>
@@ -1547,7 +2262,35 @@
         <w:rPr>
           <w:lang w:val="en-US"/>
         </w:rPr>
-        <w:t> (Reducción propretonica)</w:t>
+        <w:t> (</w:t>
+      </w:r>
+      <w:proofErr w:type="spellStart"/>
+      <w:r>
+        <w:rPr>
+          <w:lang w:val="en-US"/>
+        </w:rPr>
+        <w:t>Reducción</w:t>
+      </w:r>
+      <w:proofErr w:type="spellEnd"/>
+      <w:r>
+        <w:rPr>
+          <w:lang w:val="en-US"/>
+        </w:rPr>
+        <w:t xml:space="preserve"> </w:t>
+      </w:r>
+      <w:proofErr w:type="spellStart"/>
+      <w:r>
+        <w:rPr>
+          <w:lang w:val="en-US"/>
+        </w:rPr>
+        <w:t>propretonica</w:t>
+      </w:r>
+      <w:proofErr w:type="spellEnd"/>
+      <w:r>
+        <w:rPr>
+          <w:lang w:val="en-US"/>
+        </w:rPr>
+        <w:t>)</w:t>
       </w:r>
     </w:p>
     <w:p>
@@ -1572,7 +2315,21 @@
         <w:rPr>
           <w:lang w:val="en-US"/>
         </w:rPr>
-        <w:t> (Segolados)</w:t>
+        <w:t> (</w:t>
+      </w:r>
+      <w:proofErr w:type="spellStart"/>
+      <w:r>
+        <w:rPr>
+          <w:lang w:val="en-US"/>
+        </w:rPr>
+        <w:t>Segolados</w:t>
+      </w:r>
+      <w:proofErr w:type="spellEnd"/>
+      <w:r>
+        <w:rPr>
+          <w:lang w:val="en-US"/>
+        </w:rPr>
+        <w:t>)</w:t>
       </w:r>
     </w:p>
     <w:p>
@@ -1609,7 +2366,35 @@
         <w:rPr>
           <w:lang w:val="en-US"/>
         </w:rPr>
-        <w:t xml:space="preserve"> es dual en forma pero singular en significado)</w:t>
+        <w:t xml:space="preserve"> es dual en forma </w:t>
+      </w:r>
+      <w:proofErr w:type="spellStart"/>
+      <w:r>
+        <w:rPr>
+          <w:lang w:val="en-US"/>
+        </w:rPr>
+        <w:t>pero</w:t>
+      </w:r>
+      <w:proofErr w:type="spellEnd"/>
+      <w:r>
+        <w:rPr>
+          <w:lang w:val="en-US"/>
+        </w:rPr>
+        <w:t xml:space="preserve"> singular en </w:t>
+      </w:r>
+      <w:proofErr w:type="spellStart"/>
+      <w:r>
+        <w:rPr>
+          <w:lang w:val="en-US"/>
+        </w:rPr>
+        <w:t>significado</w:t>
+      </w:r>
+      <w:proofErr w:type="spellEnd"/>
+      <w:r>
+        <w:rPr>
+          <w:lang w:val="en-US"/>
+        </w:rPr>
+        <w:t>)</w:t>
       </w:r>
     </w:p>
     <w:p>
@@ -1634,7 +2419,21 @@
         <w:rPr>
           <w:lang w:val="en-US"/>
         </w:rPr>
-        <w:t> (Daguesh Forte)</w:t>
+        <w:t> (</w:t>
+      </w:r>
+      <w:proofErr w:type="spellStart"/>
+      <w:r>
+        <w:rPr>
+          <w:lang w:val="en-US"/>
+        </w:rPr>
+        <w:t>Daguesh</w:t>
+      </w:r>
+      <w:proofErr w:type="spellEnd"/>
+      <w:r>
+        <w:rPr>
+          <w:lang w:val="en-US"/>
+        </w:rPr>
+        <w:t xml:space="preserve"> Forte)</w:t>
       </w:r>
     </w:p>
     <w:p>
@@ -1643,22 +2442,15 @@
           <w:ilvl w:val="0"/>
           <w:numId w:val="1"/>
         </w:numPr>
-        <w:rPr>
-          <w:lang w:val="en-US"/>
-        </w:rPr>
-      </w:pPr>
-      <w:r>
-        <w:rPr>
-          <w:b/>
-          <w:bCs/>
-          <w:lang w:val="en-US"/>
+      </w:pPr>
+      <w:r>
+        <w:rPr>
+          <w:b/>
+          <w:bCs/>
         </w:rPr>
         <w:t>b</w:t>
       </w:r>
       <w:r>
-        <w:rPr>
-          <w:lang w:val="en-US"/>
-        </w:rPr>
         <w:t> (Se aplica la primera regla del Shewa)</w:t>
       </w:r>
     </w:p>
@@ -1670,13 +2462,23 @@
           <w:lang w:val="en-US"/>
         </w:rPr>
       </w:pPr>
-      <w:r>
-        <w:rPr>
-          <w:b/>
-          <w:bCs/>
-          <w:lang w:val="en-US"/>
-        </w:rPr>
-        <w:t>Vocabulario:</w:t>
+      <w:proofErr w:type="spellStart"/>
+      <w:r>
+        <w:rPr>
+          <w:b/>
+          <w:bCs/>
+          <w:lang w:val="en-US"/>
+        </w:rPr>
+        <w:t>Vocabulario</w:t>
+      </w:r>
+      <w:proofErr w:type="spellEnd"/>
+      <w:r>
+        <w:rPr>
+          <w:b/>
+          <w:bCs/>
+          <w:lang w:val="en-US"/>
+        </w:rPr>
+        <w:t>:</w:t>
       </w:r>
     </w:p>
     <w:p>
@@ -1726,7 +2528,21 @@
         <w:rPr>
           <w:lang w:val="en-US"/>
         </w:rPr>
-        <w:t> (Hombre, esposo)</w:t>
+        <w:t xml:space="preserve"> (Hombre, </w:t>
+      </w:r>
+      <w:proofErr w:type="spellStart"/>
+      <w:r>
+        <w:rPr>
+          <w:lang w:val="en-US"/>
+        </w:rPr>
+        <w:t>esposo</w:t>
+      </w:r>
+      <w:proofErr w:type="spellEnd"/>
+      <w:r>
+        <w:rPr>
+          <w:lang w:val="en-US"/>
+        </w:rPr>
+        <w:t>)</w:t>
       </w:r>
     </w:p>
     <w:p>
@@ -1751,7 +2567,21 @@
         <w:rPr>
           <w:lang w:val="en-US"/>
         </w:rPr>
-        <w:t> (Hija)</w:t>
+        <w:t> (</w:t>
+      </w:r>
+      <w:proofErr w:type="spellStart"/>
+      <w:r>
+        <w:rPr>
+          <w:lang w:val="en-US"/>
+        </w:rPr>
+        <w:t>Hija</w:t>
+      </w:r>
+      <w:proofErr w:type="spellEnd"/>
+      <w:r>
+        <w:rPr>
+          <w:lang w:val="en-US"/>
+        </w:rPr>
+        <w:t>)</w:t>
       </w:r>
     </w:p>
     <w:p>
@@ -1776,7 +2606,21 @@
         <w:rPr>
           <w:lang w:val="en-US"/>
         </w:rPr>
-        <w:t> (Alma, vida, persona)</w:t>
+        <w:t xml:space="preserve"> (Alma, </w:t>
+      </w:r>
+      <w:proofErr w:type="spellStart"/>
+      <w:r>
+        <w:rPr>
+          <w:lang w:val="en-US"/>
+        </w:rPr>
+        <w:t>vida</w:t>
+      </w:r>
+      <w:proofErr w:type="spellEnd"/>
+      <w:r>
+        <w:rPr>
+          <w:lang w:val="en-US"/>
+        </w:rPr>
+        <w:t>, persona)</w:t>
       </w:r>
     </w:p>
     <w:p>
@@ -1826,7 +2670,21 @@
         <w:rPr>
           <w:lang w:val="en-US"/>
         </w:rPr>
-        <w:t> (Ley, instrucción)</w:t>
+        <w:t xml:space="preserve"> (Ley, </w:t>
+      </w:r>
+      <w:proofErr w:type="spellStart"/>
+      <w:r>
+        <w:rPr>
+          <w:lang w:val="en-US"/>
+        </w:rPr>
+        <w:t>instrucción</w:t>
+      </w:r>
+      <w:proofErr w:type="spellEnd"/>
+      <w:r>
+        <w:rPr>
+          <w:lang w:val="en-US"/>
+        </w:rPr>
+        <w:t>)</w:t>
       </w:r>
     </w:p>
     <w:p>
@@ -1877,7 +2735,35 @@
         <w:rPr>
           <w:lang w:val="en-US"/>
         </w:rPr>
-        <w:t> (Cabeza, jefe)</w:t>
+        <w:t> (</w:t>
+      </w:r>
+      <w:proofErr w:type="spellStart"/>
+      <w:r>
+        <w:rPr>
+          <w:lang w:val="en-US"/>
+        </w:rPr>
+        <w:t>Cabeza</w:t>
+      </w:r>
+      <w:proofErr w:type="spellEnd"/>
+      <w:r>
+        <w:rPr>
+          <w:lang w:val="en-US"/>
+        </w:rPr>
+        <w:t xml:space="preserve">, </w:t>
+      </w:r>
+      <w:proofErr w:type="spellStart"/>
+      <w:r>
+        <w:rPr>
+          <w:lang w:val="en-US"/>
+        </w:rPr>
+        <w:t>jefe</w:t>
+      </w:r>
+      <w:proofErr w:type="spellEnd"/>
+      <w:r>
+        <w:rPr>
+          <w:lang w:val="en-US"/>
+        </w:rPr>
+        <w:t>)</w:t>
       </w:r>
     </w:p>
     <w:p>
@@ -1902,7 +2788,21 @@
         <w:rPr>
           <w:lang w:val="en-US"/>
         </w:rPr>
-        <w:t> (Profeta)</w:t>
+        <w:t> (</w:t>
+      </w:r>
+      <w:proofErr w:type="spellStart"/>
+      <w:r>
+        <w:rPr>
+          <w:lang w:val="en-US"/>
+        </w:rPr>
+        <w:t>Profeta</w:t>
+      </w:r>
+      <w:proofErr w:type="spellEnd"/>
+      <w:r>
+        <w:rPr>
+          <w:lang w:val="en-US"/>
+        </w:rPr>
+        <w:t>)</w:t>
       </w:r>
     </w:p>
     <w:p>
@@ -1927,13 +2827,24 @@
         <w:rPr>
           <w:lang w:val="en-US"/>
         </w:rPr>
-        <w:t> (Hermano)</w:t>
-      </w:r>
-    </w:p>
-    <w:p>
-      <w:bookmarkStart w:id="0" w:name="_GoBack"/>
-      <w:bookmarkEnd w:id="0"/>
-    </w:p>
+        <w:t> (</w:t>
+      </w:r>
+      <w:proofErr w:type="spellStart"/>
+      <w:r>
+        <w:rPr>
+          <w:lang w:val="en-US"/>
+        </w:rPr>
+        <w:t>Hermano</w:t>
+      </w:r>
+      <w:proofErr w:type="spellEnd"/>
+      <w:r>
+        <w:rPr>
+          <w:lang w:val="en-US"/>
+        </w:rPr>
+        <w:t>)</w:t>
+      </w:r>
+    </w:p>
+    <w:p/>
     <w:sectPr>
       <w:pgSz w:w="12240" w:h="15840"/>
       <w:pgMar w:top="1440" w:right="1440" w:bottom="1440" w:left="1440" w:header="720" w:footer="720" w:gutter="0"/>
@@ -2587,6 +3498,7 @@
   <w:style w:type="character" w:default="1" w:styleId="Fuentedeprrafopredeter">
     <w:name w:val="Default Paragraph Font"/>
     <w:uiPriority w:val="1"/>
+    <w:semiHidden/>
     <w:unhideWhenUsed/>
   </w:style>
   <w:style w:type="table" w:default="1" w:styleId="Tablanormal">

</xml_diff>